<commit_message>
Clean and consolidate Digital Resource Companion V1.0
</commit_message>
<xml_diff>
--- a/chapters/01/core/AIHE-A01/edit/docx/AIHE-A01_template_and_worked_example.docx
+++ b/chapters/01/core/AIHE-A01/edit/docx/AIHE-A01_template_and_worked_example.docx
@@ -5,7 +5,7 @@
     <w:p>
       <w:pPr>
         <w:pStyle w:val="Title"/>
-        <w:jc w:val="center"/>
+        <w:jc w:val="centre"/>
       </w:pPr>
       <w:r>
         <w:t>Decision and Use-Case Specification</w:t>
@@ -13,7 +13,7 @@
     </w:p>
     <w:p>
       <w:pPr>
-        <w:jc w:val="center"/>
+        <w:jc w:val="centre"/>
       </w:pPr>
       <w:r>
         <w:rPr>
@@ -165,7 +165,7 @@
       <w:tblPr>
         <w:tblStyle w:val="TableGrid"/>
         <w:tblW w:type="auto" w:w="0"/>
-        <w:jc w:val="center"/>
+        <w:jc w:val="centre"/>
         <w:tblLook w:firstColumn="1" w:firstRow="1" w:lastColumn="0" w:lastRow="0" w:noHBand="0" w:noVBand="1" w:val="04A0"/>
       </w:tblPr>
       <w:tblGrid>
@@ -668,9 +668,7 @@
       </w:tr>
     </w:tbl>
     <w:p>
-      <w:r>
-        <w:br w:type="page"/>
-      </w:r>
+      <w:r/>
     </w:p>
     <w:p>
       <w:pPr>
@@ -689,7 +687,7 @@
       <w:tblPr>
         <w:tblStyle w:val="TableGrid"/>
         <w:tblW w:type="auto" w:w="0"/>
-        <w:jc w:val="center"/>
+        <w:jc w:val="centre"/>
         <w:tblLook w:firstColumn="1" w:firstRow="1" w:lastColumn="0" w:lastRow="0" w:noHBand="0" w:noVBand="1" w:val="04A0"/>
       </w:tblPr>
       <w:tblGrid>
@@ -1203,6 +1201,7 @@
     </w:tbl>
     <w:sectPr>
       <w:footerReference w:type="default" r:id="rId9"/>
+      <w:headerReference w:type="default" r:id="rId10"/>
       <w:pgSz w:w="12240" w:h="15840"/>
       <w:pgMar w:top="1008" w:right="1080" w:bottom="1008" w:left="1080" w:header="720" w:footer="720" w:gutter="0"/>
       <w:cols w:space="720"/>
@@ -1217,17 +1216,45 @@
   <w:p>
     <w:pPr>
       <w:pStyle w:val="Footer"/>
-      <w:jc w:val="center"/>
+      <w:jc w:val="centre"/>
     </w:pPr>
     <w:r>
       <w:rPr>
-        <w:color w:val="646464"/>
-        <w:sz w:val="16"/>
-      </w:rPr>
-      <w:t>AIHE-A01 | V1.0 | Create a governed copy before use</w:t>
+        <w:color w:val="5F5A5B"/>
+        <w:sz w:val="15"/>
+      </w:rPr>
+      <w:t>Muthana Zouri · Carmen Marinela Cumpăt · Grigore T. Popa University of Medicine and Pharmacy Publishing House · 2026</w:t>
     </w:r>
   </w:p>
 </w:ftr>
+</file>
+
+<file path=word/header1.xml><?xml version="1.0" encoding="utf-8"?>
+<w:hdr xmlns:m="http://schemas.openxmlformats.org/officeDocument/2006/math" xmlns:mc="http://schemas.openxmlformats.org/markup-compatibility/2006" xmlns:mo="http://schemas.microsoft.com/office/mac/office/2008/main" xmlns:mv="urn:schemas-microsoft-com:mac:vml" xmlns:o="urn:schemas-microsoft-com:office:office" xmlns:r="http://schemas.openxmlformats.org/officeDocument/2006/relationships" xmlns:v="urn:schemas-microsoft-com:vml" xmlns:w10="urn:schemas-microsoft-com:office:word" xmlns:w14="http://schemas.microsoft.com/office/word/2010/wordml" xmlns:w="http://schemas.openxmlformats.org/wordprocessingml/2006/main" xmlns:wne="http://schemas.microsoft.com/office/word/2006/wordml" xmlns:wp14="http://schemas.microsoft.com/office/word/2010/wordprocessingDrawing" xmlns:wp="http://schemas.openxmlformats.org/drawingml/2006/wordprocessingDrawing" xmlns:wpc="http://schemas.microsoft.com/office/word/2010/wordprocessingCanvas" xmlns:wpg="http://schemas.microsoft.com/office/word/2010/wordprocessingGroup" xmlns:wpi="http://schemas.microsoft.com/office/word/2010/wordprocessingInk" xmlns:wps="http://schemas.microsoft.com/office/word/2010/wordprocessingShape" mc:Ignorable="w14 wp14">
+  <w:p>
+    <w:pPr>
+      <w:pStyle w:val="Header"/>
+      <w:jc w:val="centre"/>
+    </w:pPr>
+    <w:r/>
+    <w:r>
+      <w:rPr>
+        <w:rFonts w:ascii="Georgia" w:hAnsi="Georgia"/>
+        <w:b/>
+        <w:color w:val="7B1734"/>
+        <w:sz w:val="17"/>
+      </w:rPr>
+      <w:t>Artificial Intelligence and Healthcare Economics</w:t>
+    </w:r>
+    <w:r>
+      <w:rPr>
+        <w:color w:val="5F5A5B"/>
+        <w:sz w:val="16"/>
+      </w:rPr>
+      <w:t xml:space="preserve"> · Digital Resource Companion · V1.0</w:t>
+    </w:r>
+  </w:p>
+</w:hdr>
 </file>
 
 <file path=word/numbering.xml><?xml version="1.0" encoding="utf-8"?>
@@ -1607,7 +1634,7 @@
     <w:rsid w:val="00E618BF"/>
     <w:pPr>
       <w:tabs>
-        <w:tab w:val="center" w:pos="4680"/>
+        <w:tab w:val="centre" w:pos="4680"/>
         <w:tab w:val="right" w:pos="9360"/>
       </w:tabs>
       <w:spacing w:after="0" w:line="240" w:lineRule="auto"/>
@@ -1629,7 +1656,7 @@
     <w:rsid w:val="00E618BF"/>
     <w:pPr>
       <w:tabs>
-        <w:tab w:val="center" w:pos="4680"/>
+        <w:tab w:val="centre" w:pos="4680"/>
         <w:tab w:val="right" w:pos="9360"/>
       </w:tabs>
       <w:spacing w:after="0" w:line="240" w:lineRule="auto"/>

</xml_diff>